<commit_message>
Day 11 Lab Solutions
</commit_message>
<xml_diff>
--- a/Day15_Capstone_Project.docx
+++ b/Day15_Capstone_Project.docx
@@ -289,12 +289,6 @@
         <w:gridCol w:w="5711"/>
       </w:tblGrid>
       <w:tr>
-        <w:tblPrEx>
-          <w:tblCellMar>
-            <w:top w:w="0" w:type="dxa"/>
-            <w:bottom w:w="0" w:type="dxa"/>
-          </w:tblCellMar>
-        </w:tblPrEx>
         <w:tc>
           <w:tcPr>
             <w:tcW w:w="0" w:type="auto"/>
@@ -387,12 +381,6 @@
         </w:tc>
       </w:tr>
       <w:tr>
-        <w:tblPrEx>
-          <w:tblCellMar>
-            <w:top w:w="0" w:type="dxa"/>
-            <w:bottom w:w="0" w:type="dxa"/>
-          </w:tblCellMar>
-        </w:tblPrEx>
         <w:tc>
           <w:tcPr>
             <w:tcW w:w="0" w:type="auto"/>
@@ -416,14 +404,21 @@
                 <w:sz w:val="22"/>
                 <w:szCs w:val="22"/>
               </w:rPr>
-              <w:t>Tuesday</w:t>
+              <w:t>Tuesday (Day 1</w:t>
             </w:r>
             <w:r>
               <w:rPr>
                 <w:sz w:val="22"/>
                 <w:szCs w:val="22"/>
               </w:rPr>
-              <w:t xml:space="preserve"> (Day 11)</w:t>
+              <w:t>2</w:t>
+            </w:r>
+            <w:r>
+              <w:rPr>
+                <w:sz w:val="22"/>
+                <w:szCs w:val="22"/>
+              </w:rPr>
+              <w:t>)</w:t>
             </w:r>
           </w:p>
         </w:tc>
@@ -483,12 +478,6 @@
         </w:tc>
       </w:tr>
       <w:tr>
-        <w:tblPrEx>
-          <w:tblCellMar>
-            <w:top w:w="0" w:type="dxa"/>
-            <w:bottom w:w="0" w:type="dxa"/>
-          </w:tblCellMar>
-        </w:tblPrEx>
         <w:tc>
           <w:tcPr>
             <w:tcW w:w="0" w:type="auto"/>
@@ -573,12 +562,6 @@
         </w:tc>
       </w:tr>
       <w:tr>
-        <w:tblPrEx>
-          <w:tblCellMar>
-            <w:top w:w="0" w:type="dxa"/>
-            <w:bottom w:w="0" w:type="dxa"/>
-          </w:tblCellMar>
-        </w:tblPrEx>
         <w:tc>
           <w:tcPr>
             <w:tcW w:w="0" w:type="auto"/>
@@ -684,12 +667,6 @@
         <w:gridCol w:w="9360"/>
       </w:tblGrid>
       <w:tr>
-        <w:tblPrEx>
-          <w:tblCellMar>
-            <w:top w:w="0" w:type="dxa"/>
-            <w:bottom w:w="0" w:type="dxa"/>
-          </w:tblCellMar>
-        </w:tblPrEx>
         <w:tc>
           <w:tcPr>
             <w:tcW w:w="0" w:type="auto"/>
@@ -1025,12 +1002,6 @@
         <w:gridCol w:w="9360"/>
       </w:tblGrid>
       <w:tr>
-        <w:tblPrEx>
-          <w:tblCellMar>
-            <w:top w:w="0" w:type="dxa"/>
-            <w:bottom w:w="0" w:type="dxa"/>
-          </w:tblCellMar>
-        </w:tblPrEx>
         <w:tc>
           <w:tcPr>
             <w:tcW w:w="0" w:type="auto"/>
@@ -1364,15 +1335,13 @@
         <w:t xml:space="preserve">, then </w:t>
       </w:r>
       <w:r>
-        <w:t xml:space="preserve">I’ll give you some feedback on how to implement an analysis </w:t>
-      </w:r>
-      <w:proofErr w:type="spellStart"/>
-      <w:r>
-        <w:t>pipline</w:t>
-      </w:r>
-      <w:proofErr w:type="spellEnd"/>
-      <w:r>
-        <w:t xml:space="preserve">. </w:t>
+        <w:t>I’ll give you some feedback on how to implement an analysis pip</w:t>
+      </w:r>
+      <w:r>
+        <w:t>e</w:t>
+      </w:r>
+      <w:r>
+        <w:t xml:space="preserve">line. </w:t>
       </w:r>
     </w:p>
     <w:p>

</xml_diff>